<commit_message>
revision body coming off
</commit_message>
<xml_diff>
--- a/papers/body_coming_off/abstract.docx
+++ b/papers/body_coming_off/abstract.docx
@@ -1,6 +1,6 @@
 
 <file path=word/document.xml><?xml version="1.0" encoding="utf-8"?>
-<w:document xmlns:wpc="http://schemas.microsoft.com/office/word/2010/wordprocessingCanvas" xmlns:cx="http://schemas.microsoft.com/office/drawing/2014/chartex" xmlns:cx1="http://schemas.microsoft.com/office/drawing/2015/9/8/chartex" xmlns:cx2="http://schemas.microsoft.com/office/drawing/2015/10/21/chartex" xmlns:cx3="http://schemas.microsoft.com/office/drawing/2016/5/9/chartex" xmlns:cx4="http://schemas.microsoft.com/office/drawing/2016/5/10/chartex" xmlns:cx5="http://schemas.microsoft.com/office/drawing/2016/5/11/chartex" xmlns:cx6="http://schemas.microsoft.com/office/drawing/2016/5/12/chartex" xmlns:cx7="http://schemas.microsoft.com/office/drawing/2016/5/13/chartex" xmlns:cx8="http://schemas.microsoft.com/office/drawing/2016/5/14/chartex" xmlns:mc="http://schemas.openxmlformats.org/markup-compatibility/2006" xmlns:aink="http://schemas.microsoft.com/office/drawing/2016/ink" xmlns:am3d="http://schemas.microsoft.com/office/drawing/2017/model3d" xmlns:o="urn:schemas-microsoft-com:office:office" xmlns:oel="http://schemas.microsoft.com/office/2019/extlst" xmlns:r="http://schemas.openxmlformats.org/officeDocument/2006/relationships" xmlns:m="http://schemas.openxmlformats.org/officeDocument/2006/math" xmlns:v="urn:schemas-microsoft-com:vml" xmlns:wp14="http://schemas.microsoft.com/office/word/2010/wordprocessingDrawing" xmlns:wp="http://schemas.openxmlformats.org/drawingml/2006/wordprocessingDrawing" xmlns:w10="urn:schemas-microsoft-com:office:word" xmlns:w="http://schemas.openxmlformats.org/wordprocessingml/2006/main" xmlns:w14="http://schemas.microsoft.com/office/word/2010/wordml" xmlns:w15="http://schemas.microsoft.com/office/word/2012/wordml" xmlns:w16cex="http://schemas.microsoft.com/office/word/2018/wordml/cex" xmlns:w16cid="http://schemas.microsoft.com/office/word/2016/wordml/cid" xmlns:w16="http://schemas.microsoft.com/office/word/2018/wordml" xmlns:w16du="http://schemas.microsoft.com/office/word/2023/wordml/word16du" xmlns:w16sdtdh="http://schemas.microsoft.com/office/word/2020/wordml/sdtdatahash" xmlns:w16sdtfl="http://schemas.microsoft.com/office/word/2024/wordml/sdtformatlock" xmlns:w16se="http://schemas.microsoft.com/office/word/2015/wordml/symex" xmlns:wpg="http://schemas.microsoft.com/office/word/2010/wordprocessingGroup" xmlns:wpi="http://schemas.microsoft.com/office/word/2010/wordprocessingInk" xmlns:wne="http://schemas.microsoft.com/office/word/2006/wordml" xmlns:wps="http://schemas.microsoft.com/office/word/2010/wordprocessingShape" mc:Ignorable="w14 w15 w16se w16cid w16 w16cex w16sdtdh w16sdtfl w16du wp14">
+<w:document xmlns:wpc="http://schemas.microsoft.com/office/word/2010/wordprocessingCanvas" xmlns:cx="http://schemas.microsoft.com/office/drawing/2014/chartex" xmlns:cx1="http://schemas.microsoft.com/office/drawing/2015/9/8/chartex" xmlns:cx2="http://schemas.microsoft.com/office/drawing/2015/10/21/chartex" xmlns:cx3="http://schemas.microsoft.com/office/drawing/2016/5/9/chartex" xmlns:cx4="http://schemas.microsoft.com/office/drawing/2016/5/10/chartex" xmlns:cx5="http://schemas.microsoft.com/office/drawing/2016/5/11/chartex" xmlns:cx6="http://schemas.microsoft.com/office/drawing/2016/5/12/chartex" xmlns:cx7="http://schemas.microsoft.com/office/drawing/2016/5/13/chartex" xmlns:cx8="http://schemas.microsoft.com/office/drawing/2016/5/14/chartex" xmlns:mc="http://schemas.openxmlformats.org/markup-compatibility/2006" xmlns:m="http://schemas.openxmlformats.org/officeDocument/2006/math" xmlns:aink="http://schemas.microsoft.com/office/drawing/2016/ink" xmlns:am3d="http://schemas.microsoft.com/office/drawing/2017/model3d" xmlns:oel="http://schemas.microsoft.com/office/2019/extlst" xmlns:r="http://schemas.openxmlformats.org/officeDocument/2006/relationships" xmlns:wp14="http://schemas.microsoft.com/office/word/2010/wordprocessingDrawing" xmlns:wp="http://schemas.openxmlformats.org/drawingml/2006/wordprocessingDrawing" xmlns:wpg="http://schemas.microsoft.com/office/word/2010/wordprocessingGroup" xmlns:wpi="http://schemas.microsoft.com/office/word/2010/wordprocessingInk" xmlns:wps="http://schemas.microsoft.com/office/word/2010/wordprocessingShape" xmlns:o="urn:schemas-microsoft-com:office:office" xmlns:v="urn:schemas-microsoft-com:vml" xmlns:w10="urn:schemas-microsoft-com:office:word" xmlns:w="http://schemas.openxmlformats.org/wordprocessingml/2006/main" xmlns:w14="http://schemas.microsoft.com/office/word/2010/wordml" xmlns:w15="http://schemas.microsoft.com/office/word/2012/wordml" xmlns:w16cex="http://schemas.microsoft.com/office/word/2018/wordml/cex" xmlns:w16cid="http://schemas.microsoft.com/office/word/2016/wordml/cid" xmlns:w16="http://schemas.microsoft.com/office/word/2018/wordml" xmlns:w16sdtdh="http://schemas.microsoft.com/office/word/2020/wordml/sdtdatahash" xmlns:w16sdtfl="http://schemas.microsoft.com/office/word/2024/wordml/sdtformatlock" xmlns:w16se="http://schemas.microsoft.com/office/word/2015/wordml/symex" xmlns:w16du="http://schemas.microsoft.com/office/word/2023/wordml/word16du" xmlns:wne="http://schemas.microsoft.com/office/word/2006/wordml" mc:Ignorable="w14 w15 w16se w16cid w16 w16cex w16sdtdh w16sdtfl w16du wp14">
   <w:body>
     <w:p>
       <w:pPr>
@@ -12,7 +12,19 @@
         <w:rPr>
           <w:rFonts w:ascii="Times New Roman" w:hAnsi="Times New Roman" w:cs="Times New Roman"/>
         </w:rPr>
-        <w:t xml:space="preserve">This paper examines the embodiment of cisgender subjects in the reality television series </w:t>
+        <w:t xml:space="preserve">This paper </w:t>
+      </w:r>
+      <w:r>
+        <w:rPr>
+          <w:rFonts w:ascii="Times New Roman" w:hAnsi="Times New Roman" w:cs="Times New Roman"/>
+        </w:rPr>
+        <w:t xml:space="preserve">uses machine learning to analyze text based on cisgender subjects in </w:t>
+      </w:r>
+      <w:r>
+        <w:rPr>
+          <w:rFonts w:ascii="Times New Roman" w:hAnsi="Times New Roman" w:cs="Times New Roman"/>
+        </w:rPr>
+        <w:t xml:space="preserve">the reality television series </w:t>
       </w:r>
       <w:r>
         <w:rPr>
@@ -32,31 +44,183 @@
         <w:rPr>
           <w:rFonts w:ascii="Times New Roman" w:hAnsi="Times New Roman" w:cs="Times New Roman"/>
         </w:rPr>
-        <w:t xml:space="preserve"> through the lens of Trans Studies</w:t>
-      </w:r>
-      <w:r>
-        <w:rPr>
-          <w:rFonts w:ascii="Times New Roman" w:hAnsi="Times New Roman" w:cs="Times New Roman"/>
-        </w:rPr>
-        <w:t xml:space="preserve">. It </w:t>
-      </w:r>
-      <w:r>
-        <w:rPr>
-          <w:rFonts w:ascii="Times New Roman" w:hAnsi="Times New Roman" w:cs="Times New Roman"/>
-        </w:rPr>
-        <w:t>argue</w:t>
-      </w:r>
-      <w:r>
-        <w:rPr>
-          <w:rFonts w:ascii="Times New Roman" w:hAnsi="Times New Roman" w:cs="Times New Roman"/>
-        </w:rPr>
-        <w:t>s</w:t>
-      </w:r>
-      <w:r>
-        <w:rPr>
-          <w:rFonts w:ascii="Times New Roman" w:hAnsi="Times New Roman" w:cs="Times New Roman"/>
-        </w:rPr>
-        <w:t xml:space="preserve"> that participants in </w:t>
+        <w:t>.</w:t>
+      </w:r>
+      <w:r>
+        <w:rPr>
+          <w:rFonts w:ascii="Times New Roman" w:hAnsi="Times New Roman" w:cs="Times New Roman"/>
+        </w:rPr>
+        <w:t xml:space="preserve"> </w:t>
+      </w:r>
+      <w:r>
+        <w:rPr>
+          <w:rFonts w:ascii="Times New Roman" w:hAnsi="Times New Roman" w:cs="Times New Roman"/>
+        </w:rPr>
+        <w:t>From the transcripts of the show, I</w:t>
+      </w:r>
+      <w:r>
+        <w:rPr>
+          <w:rFonts w:ascii="Times New Roman" w:hAnsi="Times New Roman" w:cs="Times New Roman"/>
+        </w:rPr>
+        <w:t xml:space="preserve"> train small-scale language models </w:t>
+      </w:r>
+      <w:r>
+        <w:rPr>
+          <w:rFonts w:ascii="Times New Roman" w:hAnsi="Times New Roman" w:cs="Times New Roman"/>
+        </w:rPr>
+        <w:t xml:space="preserve">(SLMs) </w:t>
+      </w:r>
+      <w:r>
+        <w:rPr>
+          <w:rFonts w:ascii="Times New Roman" w:hAnsi="Times New Roman" w:cs="Times New Roman"/>
+        </w:rPr>
+        <w:t xml:space="preserve">and use them as </w:t>
+      </w:r>
+      <w:r>
+        <w:rPr>
+          <w:rFonts w:ascii="Times New Roman" w:hAnsi="Times New Roman" w:cs="Times New Roman"/>
+        </w:rPr>
+        <w:t>predictive instruments to surface shared linguistic and affective patterns</w:t>
+      </w:r>
+      <w:r>
+        <w:rPr>
+          <w:rFonts w:ascii="Times New Roman" w:hAnsi="Times New Roman" w:cs="Times New Roman"/>
+        </w:rPr>
+        <w:t xml:space="preserve"> among the show participants</w:t>
+      </w:r>
+      <w:r>
+        <w:rPr>
+          <w:rFonts w:ascii="Times New Roman" w:hAnsi="Times New Roman" w:cs="Times New Roman"/>
+        </w:rPr>
+        <w:t xml:space="preserve">. The experiment finds that </w:t>
+      </w:r>
+      <w:r>
+        <w:rPr>
+          <w:rFonts w:ascii="Times New Roman" w:hAnsi="Times New Roman" w:cs="Times New Roman"/>
+        </w:rPr>
+        <w:t>the</w:t>
+      </w:r>
+      <w:r>
+        <w:rPr>
+          <w:rFonts w:ascii="Times New Roman" w:hAnsi="Times New Roman" w:cs="Times New Roman"/>
+        </w:rPr>
+        <w:t xml:space="preserve">se </w:t>
+      </w:r>
+      <w:r>
+        <w:rPr>
+          <w:rFonts w:ascii="Times New Roman" w:hAnsi="Times New Roman" w:cs="Times New Roman"/>
+        </w:rPr>
+        <w:t>participants</w:t>
+      </w:r>
+      <w:r>
+        <w:rPr>
+          <w:rFonts w:ascii="Times New Roman" w:hAnsi="Times New Roman" w:cs="Times New Roman"/>
+        </w:rPr>
+        <w:t xml:space="preserve">, </w:t>
+      </w:r>
+      <w:r>
+        <w:rPr>
+          <w:rFonts w:ascii="Times New Roman" w:hAnsi="Times New Roman" w:cs="Times New Roman"/>
+        </w:rPr>
+        <w:t xml:space="preserve">while firmly anchored in </w:t>
+      </w:r>
+      <w:proofErr w:type="spellStart"/>
+      <w:r>
+        <w:rPr>
+          <w:rFonts w:ascii="Times New Roman" w:hAnsi="Times New Roman" w:cs="Times New Roman"/>
+        </w:rPr>
+        <w:t>cisnormative</w:t>
+      </w:r>
+      <w:proofErr w:type="spellEnd"/>
+      <w:r>
+        <w:rPr>
+          <w:rFonts w:ascii="Times New Roman" w:hAnsi="Times New Roman" w:cs="Times New Roman"/>
+        </w:rPr>
+        <w:t xml:space="preserve"> frameworks</w:t>
+      </w:r>
+      <w:r>
+        <w:rPr>
+          <w:rFonts w:ascii="Times New Roman" w:hAnsi="Times New Roman" w:cs="Times New Roman"/>
+        </w:rPr>
+        <w:t xml:space="preserve">, </w:t>
+      </w:r>
+      <w:r>
+        <w:rPr>
+          <w:rFonts w:ascii="Times New Roman" w:hAnsi="Times New Roman" w:cs="Times New Roman"/>
+        </w:rPr>
+        <w:t>temporarily experience a form of bodily dissonance</w:t>
+      </w:r>
+      <w:r>
+        <w:rPr>
+          <w:rFonts w:ascii="Times New Roman" w:hAnsi="Times New Roman" w:cs="Times New Roman"/>
+        </w:rPr>
+        <w:t xml:space="preserve"> and disjunction that evokes the language of body dysphoria</w:t>
+      </w:r>
+      <w:r>
+        <w:rPr>
+          <w:rFonts w:ascii="Times New Roman" w:hAnsi="Times New Roman" w:cs="Times New Roman"/>
+        </w:rPr>
+        <w:t xml:space="preserve"> from trans studies</w:t>
+      </w:r>
+      <w:r>
+        <w:rPr>
+          <w:rFonts w:ascii="Times New Roman" w:hAnsi="Times New Roman" w:cs="Times New Roman"/>
+        </w:rPr>
+        <w:t>.</w:t>
+      </w:r>
+      <w:r>
+        <w:rPr>
+          <w:rFonts w:ascii="Times New Roman" w:hAnsi="Times New Roman" w:cs="Times New Roman"/>
+        </w:rPr>
+        <w:t xml:space="preserve"> </w:t>
+      </w:r>
+      <w:r>
+        <w:rPr>
+          <w:rFonts w:ascii="Times New Roman" w:hAnsi="Times New Roman" w:cs="Times New Roman"/>
+        </w:rPr>
+        <w:t xml:space="preserve">The paper ultimately argues that </w:t>
+      </w:r>
+      <w:r>
+        <w:rPr>
+          <w:rFonts w:ascii="Times New Roman" w:hAnsi="Times New Roman" w:cs="Times New Roman"/>
+        </w:rPr>
+        <w:t>machine learning</w:t>
+      </w:r>
+      <w:r>
+        <w:rPr>
+          <w:rFonts w:ascii="Times New Roman" w:hAnsi="Times New Roman" w:cs="Times New Roman"/>
+        </w:rPr>
+        <w:t>, as an aggregative mechanism,</w:t>
+      </w:r>
+      <w:r>
+        <w:rPr>
+          <w:rFonts w:ascii="Times New Roman" w:hAnsi="Times New Roman" w:cs="Times New Roman"/>
+        </w:rPr>
+        <w:t xml:space="preserve"> </w:t>
+      </w:r>
+      <w:r>
+        <w:rPr>
+          <w:rFonts w:ascii="Times New Roman" w:hAnsi="Times New Roman" w:cs="Times New Roman"/>
+        </w:rPr>
+        <w:t>ought to</w:t>
+      </w:r>
+      <w:r>
+        <w:rPr>
+          <w:rFonts w:ascii="Times New Roman" w:hAnsi="Times New Roman" w:cs="Times New Roman"/>
+        </w:rPr>
+        <w:t xml:space="preserve"> be used </w:t>
+      </w:r>
+      <w:r>
+        <w:rPr>
+          <w:rFonts w:ascii="Times New Roman" w:hAnsi="Times New Roman" w:cs="Times New Roman"/>
+        </w:rPr>
+        <w:t xml:space="preserve">as a tool for studying </w:t>
+      </w:r>
+      <w:r>
+        <w:rPr>
+          <w:rFonts w:ascii="Times New Roman" w:hAnsi="Times New Roman" w:cs="Times New Roman"/>
+        </w:rPr>
+        <w:t xml:space="preserve">common and shared experiences in language, such as experiences of bodily disjunction and attachments to normativity, in the case of the </w:t>
       </w:r>
       <w:r>
         <w:rPr>
@@ -64,49 +228,13 @@
           <w:i/>
           <w:iCs/>
         </w:rPr>
-        <w:t>Love Is Blind</w:t>
-      </w:r>
-      <w:r>
-        <w:rPr>
-          <w:rFonts w:ascii="Times New Roman" w:hAnsi="Times New Roman" w:cs="Times New Roman"/>
-        </w:rPr>
-        <w:t>—while firmly anchored in cisnormative frameworks—temporarily experience a form of bodily dissonance</w:t>
-      </w:r>
-      <w:r>
-        <w:rPr>
-          <w:rFonts w:ascii="Times New Roman" w:hAnsi="Times New Roman" w:cs="Times New Roman"/>
-        </w:rPr>
-        <w:t xml:space="preserve"> where physical </w:t>
-      </w:r>
-      <w:r>
-        <w:rPr>
-          <w:rFonts w:ascii="Times New Roman" w:hAnsi="Times New Roman" w:cs="Times New Roman"/>
-        </w:rPr>
-        <w:t xml:space="preserve">touch becomes spectral, overdetermined, and feared. To analyze this </w:t>
-      </w:r>
-      <w:r>
-        <w:rPr>
-          <w:rFonts w:ascii="Times New Roman" w:hAnsi="Times New Roman" w:cs="Times New Roman"/>
-        </w:rPr>
-        <w:t>sensory fracture</w:t>
-      </w:r>
-      <w:r>
-        <w:rPr>
-          <w:rFonts w:ascii="Times New Roman" w:hAnsi="Times New Roman" w:cs="Times New Roman"/>
-        </w:rPr>
-        <w:t xml:space="preserve">, I train small-scale language models </w:t>
-      </w:r>
-      <w:r>
-        <w:rPr>
-          <w:rFonts w:ascii="Times New Roman" w:hAnsi="Times New Roman" w:cs="Times New Roman"/>
-        </w:rPr>
-        <w:t xml:space="preserve">(SLMs) </w:t>
-      </w:r>
-      <w:r>
-        <w:rPr>
-          <w:rFonts w:ascii="Times New Roman" w:hAnsi="Times New Roman" w:cs="Times New Roman"/>
-        </w:rPr>
-        <w:t>on transcripts from the show, using them as predictive instruments to surface shared linguistic and affective patterns around the body and touch. By mobilizing machine learning as a critical, non-extractive method, this project reframes prediction as a tool for studying normativity—demonstrating how cis participants’ attachments to bodily integrity echo trans theoretical concerns with materiality, coherence, and desire.</w:t>
+        <w:t>Love is Blind</w:t>
+      </w:r>
+      <w:r>
+        <w:rPr>
+          <w:rFonts w:ascii="Times New Roman" w:hAnsi="Times New Roman" w:cs="Times New Roman"/>
+        </w:rPr>
+        <w:t xml:space="preserve"> participants.</w:t>
       </w:r>
     </w:p>
     <w:sectPr>
@@ -120,7 +248,7 @@
 </file>
 
 <file path=word/styles.xml><?xml version="1.0" encoding="utf-8"?>
-<w:styles xmlns:mc="http://schemas.openxmlformats.org/markup-compatibility/2006" xmlns:r="http://schemas.openxmlformats.org/officeDocument/2006/relationships" xmlns:w="http://schemas.openxmlformats.org/wordprocessingml/2006/main" xmlns:w14="http://schemas.microsoft.com/office/word/2010/wordml" xmlns:w15="http://schemas.microsoft.com/office/word/2012/wordml" xmlns:w16cex="http://schemas.microsoft.com/office/word/2018/wordml/cex" xmlns:w16cid="http://schemas.microsoft.com/office/word/2016/wordml/cid" xmlns:w16="http://schemas.microsoft.com/office/word/2018/wordml" xmlns:w16du="http://schemas.microsoft.com/office/word/2023/wordml/word16du" xmlns:w16sdtdh="http://schemas.microsoft.com/office/word/2020/wordml/sdtdatahash" xmlns:w16sdtfl="http://schemas.microsoft.com/office/word/2024/wordml/sdtformatlock" xmlns:w16se="http://schemas.microsoft.com/office/word/2015/wordml/symex" mc:Ignorable="w14 w15 w16se w16cid w16 w16cex w16sdtdh w16sdtfl w16du">
+<w:styles xmlns:mc="http://schemas.openxmlformats.org/markup-compatibility/2006" xmlns:r="http://schemas.openxmlformats.org/officeDocument/2006/relationships" xmlns:w="http://schemas.openxmlformats.org/wordprocessingml/2006/main" xmlns:w14="http://schemas.microsoft.com/office/word/2010/wordml" xmlns:w15="http://schemas.microsoft.com/office/word/2012/wordml" xmlns:w16cex="http://schemas.microsoft.com/office/word/2018/wordml/cex" xmlns:w16cid="http://schemas.microsoft.com/office/word/2016/wordml/cid" xmlns:w16="http://schemas.microsoft.com/office/word/2018/wordml" xmlns:w16sdtdh="http://schemas.microsoft.com/office/word/2020/wordml/sdtdatahash" xmlns:w16sdtfl="http://schemas.microsoft.com/office/word/2024/wordml/sdtformatlock" xmlns:w16se="http://schemas.microsoft.com/office/word/2015/wordml/symex" xmlns:w16du="http://schemas.microsoft.com/office/word/2023/wordml/word16du" mc:Ignorable="w14 w15 w16se w16cid w16 w16cex w16sdtdh w16sdtfl w16du">
   <w:docDefaults>
     <w:rPrDefault>
       <w:rPr>

</xml_diff>